<commit_message>
docs(data): add Chrome QA harnesses and stop tracking generated test output
</commit_message>
<xml_diff>
--- a/GOOGLE_DEMO_VIDEO_REQUIREMENTS.docx
+++ b/GOOGLE_DEMO_VIDEO_REQUIREMENTS.docx
@@ -108,7 +108,36 @@
               <w:rPr>
                 <w:sz w:val="20"/>
               </w:rPr>
-              <w:t>August 6, 2026</w:t>
+              <w:t>August 12, 2026</w:t>
+            </w:r>
+          </w:p>
+        </w:tc>
+      </w:tr>
+      <w:tr>
+        <w:tc>
+          <w:tcPr>
+            <w:tcW w:type="dxa" w:w="4680"/>
+          </w:tcPr>
+          <w:p>
+            <w:r>
+              <w:rPr>
+                <w:b/>
+                <w:sz w:val="20"/>
+              </w:rPr>
+              <w:t>Revised</w:t>
+            </w:r>
+          </w:p>
+        </w:tc>
+        <w:tc>
+          <w:tcPr>
+            <w:tcW w:type="dxa" w:w="4680"/>
+          </w:tcPr>
+          <w:p>
+            <w:r>
+              <w:rPr>
+                <w:sz w:val="20"/>
+              </w:rPr>
+              <w:t>August 12, 2026 — aligned to production after the day’s frontend and backend deploys (Ask AI spoken-date intents, Contacts refresh, Inbox reading pane for Reply-ready mail, in-app Sent folder).</w:t>
             </w:r>
           </w:p>
         </w:tc>
@@ -166,7 +195,7 @@
               <w:rPr>
                 <w:sz w:val="20"/>
               </w:rPr>
-              <w:t>https://app.velvetelves.com</w:t>
+              <w:t>https://app.velvetelves.com (live production, not stage)</w:t>
             </w:r>
           </w:p>
         </w:tc>
@@ -375,101 +404,14 @@
           <w:b/>
           <w:sz w:val="20"/>
         </w:rPr>
-        <w:t>The scope string fix is deployed.</w:t>
+        <w:t>Record on production</w:t>
       </w:r>
       <w:r>
         <w:rPr>
           <w:b w:val="0"/>
           <w:sz w:val="20"/>
         </w:rPr>
-        <w:t xml:space="preserve"> The backend currently requests the shorthand </w:t>
-      </w:r>
-      <w:r>
-        <w:rPr>
-          <w:rFonts w:ascii="Consolas" w:hAnsi="Consolas"/>
-          <w:b w:val="0"/>
-          <w:sz w:val="20"/>
-        </w:rPr>
-        <w:t>email</w:t>
-      </w:r>
-      <w:r>
-        <w:rPr>
-          <w:b w:val="0"/>
-          <w:sz w:val="20"/>
-        </w:rPr>
-        <w:t xml:space="preserve"> and </w:t>
-      </w:r>
-      <w:r>
-        <w:rPr>
-          <w:rFonts w:ascii="Consolas" w:hAnsi="Consolas"/>
-          <w:b w:val="0"/>
-          <w:sz w:val="20"/>
-        </w:rPr>
-        <w:t>profile</w:t>
-      </w:r>
-      <w:r>
-        <w:rPr>
-          <w:b w:val="0"/>
-          <w:sz w:val="20"/>
-        </w:rPr>
-        <w:t xml:space="preserve"> while the Console declares </w:t>
-      </w:r>
-      <w:r>
-        <w:rPr>
-          <w:rFonts w:ascii="Consolas" w:hAnsi="Consolas"/>
-          <w:b w:val="0"/>
-          <w:sz w:val="20"/>
-        </w:rPr>
-        <w:t>.../auth/userinfo.email</w:t>
-      </w:r>
-      <w:r>
-        <w:rPr>
-          <w:b w:val="0"/>
-          <w:sz w:val="20"/>
-        </w:rPr>
-        <w:t xml:space="preserve"> and </w:t>
-      </w:r>
-      <w:r>
-        <w:rPr>
-          <w:rFonts w:ascii="Consolas" w:hAnsi="Consolas"/>
-          <w:b w:val="0"/>
-          <w:sz w:val="20"/>
-        </w:rPr>
-        <w:t>.../auth/userinfo.profile</w:t>
-      </w:r>
-      <w:r>
-        <w:rPr>
-          <w:b w:val="0"/>
-          <w:sz w:val="20"/>
-        </w:rPr>
-        <w:t>. Google asked for a strict string match. Record only after the corrected scopes are live.</w:t>
-      </w:r>
-    </w:p>
-    <w:p>
-      <w:pPr>
-        <w:spacing w:after="40"/>
-        <w:ind w:left="357" w:hanging="255"/>
-      </w:pPr>
-      <w:r>
-        <w:rPr>
-          <w:b w:val="0"/>
-          <w:sz w:val="20"/>
-        </w:rPr>
-        <w:t xml:space="preserve">2. </w:t>
-      </w:r>
-      <w:r>
-        <w:rPr>
-          <w:b/>
-          <w:sz w:val="20"/>
-        </w:rPr>
-        <w:t>A reviewer test account exists</w:t>
-      </w:r>
-      <w:r>
-        <w:rPr>
-          <w:b w:val="0"/>
-          <w:sz w:val="20"/>
-        </w:rPr>
-        <w:t xml:space="preserve"> on </w:t>
+        <w:t xml:space="preserve">, </w:t>
       </w:r>
       <w:r>
         <w:rPr>
@@ -484,7 +426,34 @@
           <w:b w:val="0"/>
           <w:sz w:val="20"/>
         </w:rPr>
-        <w:t xml:space="preserve"> with no phone verification, no card and no MFA. This is the same account handed to Trust and Safety, so what they see when they log in should match the video.</w:t>
+        <w:t>. Stage uses a different Google project; a consent screen filmed there will not match the submission.</w:t>
+      </w:r>
+    </w:p>
+    <w:p>
+      <w:pPr>
+        <w:spacing w:after="40"/>
+        <w:ind w:left="357" w:hanging="255"/>
+      </w:pPr>
+      <w:r>
+        <w:rPr>
+          <w:b w:val="0"/>
+          <w:sz w:val="20"/>
+        </w:rPr>
+        <w:t xml:space="preserve">2. </w:t>
+      </w:r>
+      <w:r>
+        <w:rPr>
+          <w:b/>
+          <w:sz w:val="20"/>
+        </w:rPr>
+        <w:t>Record on the same account Google will log into.</w:t>
+      </w:r>
+      <w:r>
+        <w:rPr>
+          <w:b w:val="0"/>
+          <w:sz w:val="20"/>
+        </w:rPr>
+        <w:t xml:space="preserve"> The Trust and Safety credentials must open the workspace the video shows. If the video is Jake’s brokerage account, those are the credentials to send — not a separate test admin.</w:t>
       </w:r>
     </w:p>
     <w:p>
@@ -538,7 +507,7 @@
           <w:b w:val="0"/>
           <w:sz w:val="20"/>
         </w:rPr>
-        <w:t xml:space="preserve"> to connect. Its inbox and Sent folder will be on camera.</w:t>
+        <w:t xml:space="preserve"> to connect. Its inbox and Sent folder will be on camera. Do not connect a personal mailbox.</w:t>
       </w:r>
     </w:p>
     <w:p>
@@ -565,7 +534,105 @@
           <w:b w:val="0"/>
           <w:sz w:val="20"/>
         </w:rPr>
-        <w:t xml:space="preserve"> to send the inbound test message from.</w:t>
+        <w:t xml:space="preserve"> to send the inbound test message from. The body must mention the property address of the deal you will walk in Scene 3.</w:t>
+      </w:r>
+    </w:p>
+    <w:p>
+      <w:pPr>
+        <w:spacing w:after="40"/>
+        <w:ind w:left="357" w:hanging="255"/>
+      </w:pPr>
+      <w:r>
+        <w:rPr>
+          <w:b w:val="0"/>
+          <w:sz w:val="20"/>
+        </w:rPr>
+        <w:t xml:space="preserve">6. </w:t>
+      </w:r>
+      <w:r>
+        <w:rPr>
+          <w:b/>
+          <w:sz w:val="20"/>
+        </w:rPr>
+        <w:t>Ask AI auto-apply is off for the take.</w:t>
+      </w:r>
+      <w:r>
+        <w:rPr>
+          <w:b w:val="0"/>
+          <w:sz w:val="20"/>
+        </w:rPr>
+        <w:t xml:space="preserve"> If a proposed task shows </w:t>
+      </w:r>
+      <w:r>
+        <w:rPr>
+          <w:b/>
+          <w:sz w:val="20"/>
+        </w:rPr>
+        <w:t>Applied / Ran automatically · your rule</w:t>
+      </w:r>
+      <w:r>
+        <w:rPr>
+          <w:b w:val="0"/>
+          <w:sz w:val="20"/>
+        </w:rPr>
+        <w:t>, Approve never appears. Scene 4 requires a visible Approve click. Turn that tenant rule off, then run the prompt below.</w:t>
+      </w:r>
+    </w:p>
+    <w:p>
+      <w:pPr>
+        <w:spacing w:after="40"/>
+        <w:ind w:left="357" w:hanging="255"/>
+      </w:pPr>
+      <w:r>
+        <w:rPr>
+          <w:b w:val="0"/>
+          <w:sz w:val="20"/>
+        </w:rPr>
+        <w:t xml:space="preserve">7. </w:t>
+      </w:r>
+      <w:r>
+        <w:rPr>
+          <w:b/>
+          <w:sz w:val="20"/>
+        </w:rPr>
+        <w:t>The Google scope strings are already live</w:t>
+      </w:r>
+      <w:r>
+        <w:rPr>
+          <w:b w:val="0"/>
+          <w:sz w:val="20"/>
+        </w:rPr>
+        <w:t xml:space="preserve"> (</w:t>
+      </w:r>
+      <w:r>
+        <w:rPr>
+          <w:rFonts w:ascii="Consolas" w:hAnsi="Consolas"/>
+          <w:b w:val="0"/>
+          <w:sz w:val="20"/>
+        </w:rPr>
+        <w:t>userinfo.email</w:t>
+      </w:r>
+      <w:r>
+        <w:rPr>
+          <w:b w:val="0"/>
+          <w:sz w:val="20"/>
+        </w:rPr>
+        <w:t xml:space="preserve"> / </w:t>
+      </w:r>
+      <w:r>
+        <w:rPr>
+          <w:rFonts w:ascii="Consolas" w:hAnsi="Consolas"/>
+          <w:b w:val="0"/>
+          <w:sz w:val="20"/>
+        </w:rPr>
+        <w:t>userinfo.profile</w:t>
+      </w:r>
+      <w:r>
+        <w:rPr>
+          <w:b w:val="0"/>
+          <w:sz w:val="20"/>
+        </w:rPr>
+        <w:t xml:space="preserve"> in full). This is no longer a recording gate.</w:t>
       </w:r>
     </w:p>
     <w:p>
@@ -1020,6 +1087,277 @@
         <w:spacing w:after="120" w:before="360"/>
       </w:pPr>
       <w:r>
+        <w:t>Labels that match production</w:t>
+      </w:r>
+    </w:p>
+    <w:p>
+      <w:pPr>
+        <w:spacing w:after="80"/>
+      </w:pPr>
+      <w:r>
+        <w:rPr>
+          <w:b w:val="0"/>
+          <w:sz w:val="20"/>
+        </w:rPr>
+        <w:t>Say these names on camera. The older guides used different words.</w:t>
+      </w:r>
+    </w:p>
+    <w:tbl>
+      <w:tblPr>
+        <w:tblStyle w:val="LightGrid-Accent1"/>
+        <w:tblW w:type="auto" w:w="0"/>
+        <w:jc w:val="center"/>
+        <w:tblLook w:firstColumn="1" w:firstRow="1" w:lastColumn="0" w:lastRow="0" w:noHBand="0" w:noVBand="1" w:val="04A0"/>
+      </w:tblPr>
+      <w:tblGrid>
+        <w:gridCol w:w="4680"/>
+        <w:gridCol w:w="4680"/>
+      </w:tblGrid>
+      <w:tr>
+        <w:tc>
+          <w:tcPr>
+            <w:tcW w:type="dxa" w:w="4680"/>
+            <w:shd w:val="clear" w:color="auto" w:fill="D9E2F3"/>
+          </w:tcPr>
+          <w:p>
+            <w:pPr>
+              <w:spacing w:after="0"/>
+            </w:pPr>
+            <w:r/>
+            <w:r>
+              <w:rPr>
+                <w:b/>
+                <w:sz w:val="20"/>
+              </w:rPr>
+              <w:t>Do not say</w:t>
+            </w:r>
+          </w:p>
+        </w:tc>
+        <w:tc>
+          <w:tcPr>
+            <w:tcW w:type="dxa" w:w="4680"/>
+            <w:shd w:val="clear" w:color="auto" w:fill="D9E2F3"/>
+          </w:tcPr>
+          <w:p>
+            <w:pPr>
+              <w:spacing w:after="0"/>
+            </w:pPr>
+            <w:r/>
+            <w:r>
+              <w:rPr>
+                <w:b/>
+                <w:sz w:val="20"/>
+              </w:rPr>
+              <w:t>The product shows</w:t>
+            </w:r>
+          </w:p>
+        </w:tc>
+      </w:tr>
+      <w:tr>
+        <w:tc>
+          <w:tcPr>
+            <w:tcW w:type="dxa" w:w="4680"/>
+          </w:tcPr>
+          <w:p>
+            <w:pPr>
+              <w:spacing w:after="0"/>
+            </w:pPr>
+            <w:r/>
+            <w:r>
+              <w:rPr>
+                <w:b w:val="0"/>
+                <w:sz w:val="20"/>
+              </w:rPr>
+              <w:t>People</w:t>
+            </w:r>
+          </w:p>
+        </w:tc>
+        <w:tc>
+          <w:tcPr>
+            <w:tcW w:type="dxa" w:w="4680"/>
+          </w:tcPr>
+          <w:p>
+            <w:pPr>
+              <w:spacing w:after="0"/>
+            </w:pPr>
+            <w:r/>
+            <w:r>
+              <w:rPr>
+                <w:b/>
+                <w:sz w:val="20"/>
+              </w:rPr>
+              <w:t>Contacts</w:t>
+            </w:r>
+          </w:p>
+        </w:tc>
+      </w:tr>
+      <w:tr>
+        <w:tc>
+          <w:tcPr>
+            <w:tcW w:type="dxa" w:w="4680"/>
+          </w:tcPr>
+          <w:p>
+            <w:pPr>
+              <w:spacing w:after="0"/>
+            </w:pPr>
+            <w:r/>
+            <w:r>
+              <w:rPr>
+                <w:b w:val="0"/>
+                <w:sz w:val="20"/>
+              </w:rPr>
+              <w:t>Verification (wizard)</w:t>
+            </w:r>
+          </w:p>
+        </w:tc>
+        <w:tc>
+          <w:tcPr>
+            <w:tcW w:type="dxa" w:w="4680"/>
+          </w:tcPr>
+          <w:p>
+            <w:pPr>
+              <w:spacing w:after="0"/>
+            </w:pPr>
+            <w:r/>
+            <w:r>
+              <w:rPr>
+                <w:b/>
+                <w:sz w:val="20"/>
+              </w:rPr>
+              <w:t>Confirm Details</w:t>
+            </w:r>
+          </w:p>
+        </w:tc>
+      </w:tr>
+      <w:tr>
+        <w:tc>
+          <w:tcPr>
+            <w:tcW w:type="dxa" w:w="4680"/>
+          </w:tcPr>
+          <w:p>
+            <w:pPr>
+              <w:spacing w:after="0"/>
+            </w:pPr>
+            <w:r/>
+            <w:r>
+              <w:rPr>
+                <w:b w:val="0"/>
+                <w:sz w:val="20"/>
+              </w:rPr>
+              <w:t>AI Email Review</w:t>
+            </w:r>
+          </w:p>
+        </w:tc>
+        <w:tc>
+          <w:tcPr>
+            <w:tcW w:type="dxa" w:w="4680"/>
+          </w:tcPr>
+          <w:p>
+            <w:pPr>
+              <w:spacing w:after="0"/>
+            </w:pPr>
+            <w:r/>
+            <w:r>
+              <w:rPr>
+                <w:b/>
+                <w:sz w:val="20"/>
+              </w:rPr>
+              <w:t>Intelligence → Email</w:t>
+            </w:r>
+          </w:p>
+        </w:tc>
+      </w:tr>
+      <w:tr>
+        <w:tc>
+          <w:tcPr>
+            <w:tcW w:type="dxa" w:w="4680"/>
+          </w:tcPr>
+          <w:p>
+            <w:pPr>
+              <w:spacing w:after="0"/>
+            </w:pPr>
+            <w:r/>
+            <w:r>
+              <w:rPr>
+                <w:b w:val="0"/>
+                <w:sz w:val="20"/>
+              </w:rPr>
+              <w:t>Incoming / Needs review</w:t>
+            </w:r>
+          </w:p>
+        </w:tc>
+        <w:tc>
+          <w:tcPr>
+            <w:tcW w:type="dxa" w:w="4680"/>
+          </w:tcPr>
+          <w:p>
+            <w:pPr>
+              <w:spacing w:after="0"/>
+            </w:pPr>
+            <w:r/>
+            <w:r>
+              <w:rPr>
+                <w:b/>
+                <w:sz w:val="20"/>
+              </w:rPr>
+              <w:t>Inbox</w:t>
+            </w:r>
+            <w:r>
+              <w:rPr>
+                <w:b w:val="0"/>
+                <w:sz w:val="20"/>
+              </w:rPr>
+              <w:t xml:space="preserve"> / </w:t>
+            </w:r>
+            <w:r>
+              <w:rPr>
+                <w:b/>
+                <w:sz w:val="20"/>
+              </w:rPr>
+              <w:t>Outbox</w:t>
+            </w:r>
+            <w:r>
+              <w:rPr>
+                <w:b w:val="0"/>
+                <w:sz w:val="20"/>
+              </w:rPr>
+              <w:t xml:space="preserve"> / </w:t>
+            </w:r>
+            <w:r>
+              <w:rPr>
+                <w:b/>
+                <w:sz w:val="20"/>
+              </w:rPr>
+              <w:t>Sent</w:t>
+            </w:r>
+          </w:p>
+        </w:tc>
+      </w:tr>
+    </w:tbl>
+    <w:p/>
+    <w:p>
+      <w:pPr>
+        <w:spacing w:after="80"/>
+      </w:pPr>
+      <w:r>
+        <w:rPr>
+          <w:b w:val="0"/>
+          <w:sz w:val="20"/>
+        </w:rPr>
+        <w:t>If a document preview stays on “Preparing viewer…”, select the contract file in the list rather than waiting on a blank pane.</w:t>
+      </w:r>
+    </w:p>
+    <w:p>
+      <w:pPr>
+        <w:spacing w:after="120"/>
+      </w:pPr>
+    </w:p>
+    <w:p>
+      <w:pPr>
+        <w:pStyle w:val="Heading1"/>
+        <w:spacing w:after="120" w:before="360"/>
+      </w:pPr>
+      <w:r>
         <w:t>Part 1: The product (about 5 minutes)</w:t>
       </w:r>
     </w:p>
@@ -1278,7 +1616,7 @@
           <w:b w:val="0"/>
           <w:sz w:val="20"/>
         </w:rPr>
-        <w:t>: the checklist of what the file requires, what is in and what is missing</w:t>
+        <w:t>: the checklist of what the file requires, what is in and what is missing. Open the signed contract. If the viewer does not render, click that file in the list.</w:t>
       </w:r>
     </w:p>
     <w:p>
@@ -1298,7 +1636,7 @@
           <w:b/>
           <w:sz w:val="20"/>
         </w:rPr>
-        <w:t>People</w:t>
+        <w:t>Contacts</w:t>
       </w:r>
       <w:r>
         <w:rPr>
@@ -1338,19 +1676,126 @@
           <w:b w:val="0"/>
           <w:sz w:val="20"/>
         </w:rPr>
-        <w:t>Open the AI assistant on the deal. Ask it something in plain English about the transaction. Show it proposing an action.</w:t>
-      </w:r>
-    </w:p>
-    <w:p>
-      <w:pPr>
-        <w:spacing w:after="80"/>
-      </w:pPr>
+        <w:t xml:space="preserve">On the deal, click </w:t>
+      </w:r>
       <w:r>
         <w:rPr>
           <w:b/>
           <w:sz w:val="20"/>
         </w:rPr>
-        <w:t>Approve the proposal and show the result land on the deal.</w:t>
+        <w:t>Ask AI</w:t>
+      </w:r>
+      <w:r>
+        <w:rPr>
+          <w:b w:val="0"/>
+          <w:sz w:val="20"/>
+        </w:rPr>
+        <w:t>. Ask a fact question first so the reviewer sees deal-grounded answers (address, price, closing date).</w:t>
+      </w:r>
+    </w:p>
+    <w:p>
+      <w:pPr>
+        <w:spacing w:after="80"/>
+      </w:pPr>
+      <w:r>
+        <w:rPr>
+          <w:b w:val="0"/>
+          <w:sz w:val="20"/>
+        </w:rPr>
+        <w:t>Then use a prompt production accepts as a proposed action, including a spoken date:</w:t>
+      </w:r>
+    </w:p>
+    <w:p>
+      <w:pPr>
+        <w:spacing w:after="80"/>
+      </w:pPr>
+      <w:r>
+        <w:rPr>
+          <w:rFonts w:ascii="Consolas" w:hAnsi="Consolas"/>
+          <w:b w:val="0"/>
+          <w:sz w:val="20"/>
+        </w:rPr>
+        <w:t>Propose adding a task named Confirm title commitment reviewed due August 18, 2026</w:t>
+      </w:r>
+    </w:p>
+    <w:p>
+      <w:pPr>
+        <w:spacing w:after="80"/>
+      </w:pPr>
+      <w:r>
+        <w:rPr>
+          <w:b w:val="0"/>
+          <w:sz w:val="20"/>
+        </w:rPr>
+        <w:t xml:space="preserve">A </w:t>
+      </w:r>
+      <w:r>
+        <w:rPr>
+          <w:b/>
+          <w:sz w:val="20"/>
+        </w:rPr>
+        <w:t>Proposed action</w:t>
+      </w:r>
+      <w:r>
+        <w:rPr>
+          <w:b w:val="0"/>
+          <w:sz w:val="20"/>
+        </w:rPr>
+        <w:t xml:space="preserve"> card appears. Click </w:t>
+      </w:r>
+      <w:r>
+        <w:rPr>
+          <w:b/>
+          <w:sz w:val="20"/>
+        </w:rPr>
+        <w:t>Approve</w:t>
+      </w:r>
+      <w:r>
+        <w:rPr>
+          <w:b w:val="0"/>
+          <w:sz w:val="20"/>
+        </w:rPr>
+        <w:t xml:space="preserve">. Open the </w:t>
+      </w:r>
+      <w:r>
+        <w:rPr>
+          <w:b/>
+          <w:sz w:val="20"/>
+        </w:rPr>
+        <w:t>Tasks</w:t>
+      </w:r>
+      <w:r>
+        <w:rPr>
+          <w:b w:val="0"/>
+          <w:sz w:val="20"/>
+        </w:rPr>
+        <w:t xml:space="preserve"> tab and show the new task on the deal.</w:t>
+      </w:r>
+    </w:p>
+    <w:p>
+      <w:pPr>
+        <w:spacing w:after="80"/>
+      </w:pPr>
+      <w:r>
+        <w:rPr>
+          <w:b w:val="0"/>
+          <w:sz w:val="20"/>
+        </w:rPr>
+        <w:t xml:space="preserve">If the card instead says </w:t>
+      </w:r>
+      <w:r>
+        <w:rPr>
+          <w:b/>
+          <w:sz w:val="20"/>
+        </w:rPr>
+        <w:t>Applied / Ran automatically · your rule</w:t>
+      </w:r>
+      <w:r>
+        <w:rPr>
+          <w:b w:val="0"/>
+          <w:sz w:val="20"/>
+        </w:rPr>
+        <w:t>, stop, turn that auto-apply rule off, and re-run the prompt so Approve is on camera.</w:t>
       </w:r>
     </w:p>
     <w:p>
@@ -1409,7 +1854,21 @@
           <w:b w:val="0"/>
           <w:sz w:val="20"/>
         </w:rPr>
-        <w:t xml:space="preserve">Settings → Email &amp; E-signature → </w:t>
+        <w:t xml:space="preserve">Settings → </w:t>
+      </w:r>
+      <w:r>
+        <w:rPr>
+          <w:b/>
+          <w:sz w:val="20"/>
+        </w:rPr>
+        <w:t>Email &amp; E-signature</w:t>
+      </w:r>
+      <w:r>
+        <w:rPr>
+          <w:b w:val="0"/>
+          <w:sz w:val="20"/>
+        </w:rPr>
+        <w:t xml:space="preserve"> → </w:t>
       </w:r>
       <w:r>
         <w:rPr>
@@ -1423,7 +1882,22 @@
           <w:b w:val="0"/>
           <w:sz w:val="20"/>
         </w:rPr>
-        <w:t xml:space="preserve"> on Gmail.</w:t>
+        <w:t xml:space="preserve"> on Gmail. Direct: </w:t>
+      </w:r>
+      <w:r>
+        <w:rPr>
+          <w:rFonts w:ascii="Consolas" w:hAnsi="Consolas"/>
+          <w:b w:val="0"/>
+          <w:sz w:val="20"/>
+        </w:rPr>
+        <w:t>app.velvetelves.com/settings/connections</w:t>
+      </w:r>
+      <w:r>
+        <w:rPr>
+          <w:b w:val="0"/>
+          <w:sz w:val="20"/>
+        </w:rPr>
+        <w:t>.</w:t>
       </w:r>
     </w:p>
     <w:p>
@@ -1527,7 +2001,7 @@
           <w:b w:val="0"/>
           <w:sz w:val="20"/>
         </w:rPr>
-        <w:t>Send an email from the second mailbox to the connected account, referencing the property address of one of the seeded deals.</w:t>
+        <w:t>Send an email from the second mailbox to the connected account, referencing the property address of the Scene 3 deal.</w:t>
       </w:r>
     </w:p>
     <w:p>
@@ -1566,7 +2040,49 @@
           <w:b w:val="0"/>
           <w:sz w:val="20"/>
         </w:rPr>
-        <w:t>, with the message present</w:t>
+        <w:t xml:space="preserve">, with the message present. Click the row. The right pane opens the original message. If the AI drafted a reply, the same pane shows </w:t>
+      </w:r>
+      <w:r>
+        <w:rPr>
+          <w:b/>
+          <w:sz w:val="20"/>
+        </w:rPr>
+        <w:t>Original message</w:t>
+      </w:r>
+      <w:r>
+        <w:rPr>
+          <w:b w:val="0"/>
+          <w:sz w:val="20"/>
+        </w:rPr>
+        <w:t xml:space="preserve"> and </w:t>
+      </w:r>
+      <w:r>
+        <w:rPr>
+          <w:b/>
+          <w:sz w:val="20"/>
+        </w:rPr>
+        <w:t>Suggested reply</w:t>
+      </w:r>
+      <w:r>
+        <w:rPr>
+          <w:b w:val="0"/>
+          <w:sz w:val="20"/>
+        </w:rPr>
+        <w:t xml:space="preserve"> (the row is tagged </w:t>
+      </w:r>
+      <w:r>
+        <w:rPr>
+          <w:b/>
+          <w:sz w:val="20"/>
+        </w:rPr>
+        <w:t>Reply ready</w:t>
+      </w:r>
+      <w:r>
+        <w:rPr>
+          <w:b w:val="0"/>
+          <w:sz w:val="20"/>
+        </w:rPr>
+        <w:t xml:space="preserve"> and the deal address, not “Not linked”).</w:t>
       </w:r>
     </w:p>
     <w:p>
@@ -1600,7 +2116,7 @@
           <w:b w:val="0"/>
           <w:sz w:val="20"/>
         </w:rPr>
-        <w:t xml:space="preserve"> with no manual filing</w:t>
+        <w:t xml:space="preserve"> with no manual filing.</w:t>
       </w:r>
     </w:p>
     <w:p>
@@ -1634,7 +2150,7 @@
           <w:b w:val="0"/>
           <w:sz w:val="20"/>
         </w:rPr>
-        <w:t xml:space="preserve"> carrying the same message</w:t>
+        <w:t xml:space="preserve"> carrying the same message (Inbox on that deal).</w:t>
       </w:r>
     </w:p>
     <w:p>
@@ -1661,14 +2177,28 @@
           <w:b/>
           <w:sz w:val="20"/>
         </w:rPr>
-        <w:t>communication history</w:t>
+        <w:t>Activity → Communications</w:t>
       </w:r>
       <w:r>
         <w:rPr>
           <w:b w:val="0"/>
           <w:sz w:val="20"/>
         </w:rPr>
-        <w:t>, showing the message logged as a permanent record</w:t>
+        <w:t xml:space="preserve"> history, showing the message logged as a permanent record (</w:t>
+      </w:r>
+      <w:r>
+        <w:rPr>
+          <w:b/>
+          <w:sz w:val="20"/>
+        </w:rPr>
+        <w:t>Matched by party</w:t>
+      </w:r>
+      <w:r>
+        <w:rPr>
+          <w:b w:val="0"/>
+          <w:sz w:val="20"/>
+        </w:rPr>
+        <w:t>, Received, Gmail).</w:t>
       </w:r>
     </w:p>
     <w:p>
@@ -1688,7 +2218,21 @@
           <w:b w:val="0"/>
           <w:sz w:val="20"/>
         </w:rPr>
-        <w:t>The AI's reading of it: the category label and what it extracted</w:t>
+        <w:t xml:space="preserve">The AI's reading of it: the category chip (for a closing-date question this is </w:t>
+      </w:r>
+      <w:r>
+        <w:rPr>
+          <w:b/>
+          <w:sz w:val="20"/>
+        </w:rPr>
+        <w:t>Question</w:t>
+      </w:r>
+      <w:r>
+        <w:rPr>
+          <w:b w:val="0"/>
+          <w:sz w:val="20"/>
+        </w:rPr>
+        <w:t>) and what it extracted.</w:t>
       </w:r>
     </w:p>
     <w:p>
@@ -1721,7 +2265,35 @@
           <w:b w:val="0"/>
           <w:sz w:val="20"/>
         </w:rPr>
-        <w:t>Open the prepared draft. Show recipient, subject, body, and the panel showing what it was based on.</w:t>
+        <w:t xml:space="preserve">Stay on that Inbox pane, or open the same draft under </w:t>
+      </w:r>
+      <w:r>
+        <w:rPr>
+          <w:b/>
+          <w:sz w:val="20"/>
+        </w:rPr>
+        <w:t>Outbox</w:t>
+      </w:r>
+      <w:r>
+        <w:rPr>
+          <w:b w:val="0"/>
+          <w:sz w:val="20"/>
+        </w:rPr>
+        <w:t xml:space="preserve">. Show recipient, subject, body, and the panel showing what it was based on. The on-screen line is </w:t>
+      </w:r>
+      <w:r>
+        <w:rPr>
+          <w:b/>
+          <w:sz w:val="20"/>
+        </w:rPr>
+        <w:t>Nothing sends until you approve it</w:t>
+      </w:r>
+      <w:r>
+        <w:rPr>
+          <w:b w:val="0"/>
+          <w:sz w:val="20"/>
+        </w:rPr>
+        <w:t>.</w:t>
       </w:r>
     </w:p>
     <w:p>
@@ -1813,21 +2385,35 @@
           <w:b w:val="0"/>
           <w:sz w:val="20"/>
         </w:rPr>
-        <w:t xml:space="preserve">Then show the message in the connected account's </w:t>
+        <w:t xml:space="preserve">Then show the message in two places: </w:t>
       </w:r>
       <w:r>
         <w:rPr>
           <w:b/>
           <w:sz w:val="20"/>
         </w:rPr>
-        <w:t>Sent folder</w:t>
+        <w:t>Intelligence → Email → Sent</w:t>
       </w:r>
       <w:r>
         <w:rPr>
           <w:b w:val="0"/>
           <w:sz w:val="20"/>
         </w:rPr>
-        <w:t>, sent from the user's own address, and the same message logged back on the deal's Email tab.</w:t>
+        <w:t xml:space="preserve">, and the connected Gmail </w:t>
+      </w:r>
+      <w:r>
+        <w:rPr>
+          <w:b/>
+          <w:sz w:val="20"/>
+        </w:rPr>
+        <w:t>Sent</w:t>
+      </w:r>
+      <w:r>
+        <w:rPr>
+          <w:b w:val="0"/>
+          <w:sz w:val="20"/>
+        </w:rPr>
+        <w:t xml:space="preserve"> folder, sent from the user's own address. The same message is logged back on the deal's Email tab.</w:t>
       </w:r>
     </w:p>
     <w:p>
@@ -1921,6 +2507,21 @@
           <w:b w:val="0"/>
           <w:sz w:val="20"/>
         </w:rPr>
+        <w:t xml:space="preserve">. Direct: </w:t>
+      </w:r>
+      <w:r>
+        <w:rPr>
+          <w:rFonts w:ascii="Consolas" w:hAnsi="Consolas"/>
+          <w:b w:val="0"/>
+          <w:sz w:val="20"/>
+        </w:rPr>
+        <w:t>app.velvetelves.com/calendar</w:t>
+      </w:r>
+      <w:r>
+        <w:rPr>
+          <w:b w:val="0"/>
+          <w:sz w:val="20"/>
+        </w:rPr>
         <w:t>.</w:t>
       </w:r>
     </w:p>
@@ -2013,7 +2614,21 @@
           <w:b w:val="0"/>
           <w:sz w:val="20"/>
         </w:rPr>
-        <w:t xml:space="preserve">Settings → Email &amp; E-signature → </w:t>
+        <w:t xml:space="preserve">Settings → </w:t>
+      </w:r>
+      <w:r>
+        <w:rPr>
+          <w:b/>
+          <w:sz w:val="20"/>
+        </w:rPr>
+        <w:t>Email &amp; E-signature</w:t>
+      </w:r>
+      <w:r>
+        <w:rPr>
+          <w:b w:val="0"/>
+          <w:sz w:val="20"/>
+        </w:rPr>
+        <w:t xml:space="preserve"> → </w:t>
       </w:r>
       <w:r>
         <w:rPr>
@@ -2027,7 +2642,7 @@
           <w:b w:val="0"/>
           <w:sz w:val="20"/>
         </w:rPr>
-        <w:t xml:space="preserve"> on Gmail. Show the confirmation dialog explaining the consequence, then confirm. Show the disconnected state.</w:t>
+        <w:t xml:space="preserve"> on Gmail. Show the confirmation dialog (it explains that inbound sync and send will stop), then confirm. Show the disconnected state.</w:t>
       </w:r>
     </w:p>
     <w:p>
@@ -2383,7 +2998,7 @@
                 <w:b w:val="0"/>
                 <w:sz w:val="20"/>
               </w:rPr>
-              <w:t>Scene 6, message matched, logged, read by the AI</w:t>
+              <w:t>Scene 6, message matched, logged, read by the AI, original visible in the Inbox pane</w:t>
             </w:r>
           </w:p>
         </w:tc>
@@ -2440,7 +3055,7 @@
                 <w:b w:val="0"/>
                 <w:sz w:val="20"/>
               </w:rPr>
-              <w:t>Scene 8, approved reply in the Sent folder and on the deal</w:t>
+              <w:t>Scene 8, approved reply in Intelligence → Email → Sent, in Gmail Sent, and on the deal</w:t>
             </w:r>
           </w:p>
         </w:tc>
@@ -2793,6 +3408,33 @@
     </w:p>
     <w:p>
       <w:pPr>
+        <w:spacing w:after="40"/>
+        <w:ind w:left="357" w:hanging="255"/>
+      </w:pPr>
+      <w:r>
+        <w:rPr>
+          <w:b w:val="0"/>
+          <w:sz w:val="20"/>
+        </w:rPr>
+        <w:t xml:space="preserve">- </w:t>
+      </w:r>
+      <w:r>
+        <w:rPr>
+          <w:b/>
+          <w:sz w:val="20"/>
+        </w:rPr>
+        <w:t>The reviewer logging in to a different workspace than the video.</w:t>
+      </w:r>
+      <w:r>
+        <w:rPr>
+          <w:b w:val="0"/>
+          <w:sz w:val="20"/>
+        </w:rPr>
+        <w:t xml:space="preserve"> The credentials in the Trust and Safety thread must match the account on camera.</w:t>
+      </w:r>
+    </w:p>
+    <w:p>
+      <w:pPr>
         <w:spacing w:after="120"/>
       </w:pPr>
     </w:p>
@@ -2890,7 +3532,7 @@
           <w:b w:val="0"/>
           <w:sz w:val="20"/>
         </w:rPr>
-        <w:t xml:space="preserve"> with the link, the reviewer test credentials, and step-by-step navigation instructions.</w:t>
+        <w:t xml:space="preserve"> with the link, the reviewer test credentials (the same account as the video), and step-by-step navigation instructions.</w:t>
       </w:r>
     </w:p>
     <w:p>

</xml_diff>